<commit_message>
updating instructions for package manager
</commit_message>
<xml_diff>
--- a/docs/3.1-Creating tar files and updating tar files to the ipfs.docx
+++ b/docs/3.1-Creating tar files and updating tar files to the ipfs.docx
@@ -449,12 +449,12 @@
           <wp:inline distB="114300" distT="114300" distL="114300" distR="114300">
             <wp:extent cx="5943600" cy="5537200"/>
             <wp:effectExtent b="0" l="0" r="0" t="0"/>
-            <wp:docPr id="2" name="image4.jpg"/>
+            <wp:docPr id="2" name="image11.jpg"/>
             <a:graphic>
               <a:graphicData uri="http://schemas.openxmlformats.org/drawingml/2006/picture">
                 <pic:pic>
                   <pic:nvPicPr>
-                    <pic:cNvPr id="0" name="image4.jpg"/>
+                    <pic:cNvPr id="0" name="image11.jpg"/>
                     <pic:cNvPicPr preferRelativeResize="0"/>
                   </pic:nvPicPr>
                   <pic:blipFill>
@@ -674,12 +674,12 @@
           <wp:inline distB="114300" distT="114300" distL="114300" distR="114300">
             <wp:extent cx="5943600" cy="2514600"/>
             <wp:effectExtent b="0" l="0" r="0" t="0"/>
-            <wp:docPr id="3" name="image7.jpg"/>
+            <wp:docPr id="3" name="image8.jpg"/>
             <a:graphic>
               <a:graphicData uri="http://schemas.openxmlformats.org/drawingml/2006/picture">
                 <pic:pic>
                   <pic:nvPicPr>
-                    <pic:cNvPr id="0" name="image7.jpg"/>
+                    <pic:cNvPr id="0" name="image8.jpg"/>
                     <pic:cNvPicPr preferRelativeResize="0"/>
                   </pic:nvPicPr>
                   <pic:blipFill>
@@ -777,12 +777,12 @@
           <wp:inline distB="114300" distT="114300" distL="114300" distR="114300">
             <wp:extent cx="5943600" cy="1155700"/>
             <wp:effectExtent b="0" l="0" r="0" t="0"/>
-            <wp:docPr id="11" name="image6.png"/>
+            <wp:docPr id="11" name="image3.png"/>
             <a:graphic>
               <a:graphicData uri="http://schemas.openxmlformats.org/drawingml/2006/picture">
                 <pic:pic>
                   <pic:nvPicPr>
-                    <pic:cNvPr id="0" name="image6.png"/>
+                    <pic:cNvPr id="0" name="image3.png"/>
                     <pic:cNvPicPr preferRelativeResize="0"/>
                   </pic:nvPicPr>
                   <pic:blipFill>
@@ -1132,7 +1132,7 @@
           <w:szCs w:val="24"/>
           <w:rtl w:val="0"/>
         </w:rPr>
-        <w:t xml:space="preserve">Go to root of tcp_server folder  and open terminal</w:t>
+        <w:t xml:space="preserve">Go to root of tcp_server folder  and open terminal(Right click &gt;&gt;select Open in intermediate terminal)</w:t>
       </w:r>
     </w:p>
     <w:p>
@@ -1167,6 +1167,60 @@
     </w:p>
     <w:p>
       <w:pPr>
+        <w:ind w:left="720" w:firstLine="0"/>
+        <w:rPr>
+          <w:b w:val="1"/>
+          <w:sz w:val="28"/>
+          <w:szCs w:val="28"/>
+          <w:highlight w:val="white"/>
+        </w:rPr>
+      </w:pPr>
+      <w:r>
+        <w:rPr>
+          <w:rtl w:val="0"/>
+        </w:rPr>
+      </w:r>
+    </w:p>
+    <w:p>
+      <w:pPr>
+        <w:ind w:left="720" w:firstLine="0"/>
+        <w:rPr>
+          <w:sz w:val="26"/>
+          <w:szCs w:val="26"/>
+          <w:shd w:fill="d0e0e3" w:val="clear"/>
+        </w:rPr>
+      </w:pPr>
+      <w:r>
+        <w:rPr>
+          <w:b w:val="1"/>
+          <w:sz w:val="28"/>
+          <w:szCs w:val="28"/>
+          <w:highlight w:val="white"/>
+          <w:rtl w:val="0"/>
+        </w:rPr>
+        <w:t xml:space="preserve">Suggestions: </w:t>
+      </w:r>
+      <w:r>
+        <w:rPr>
+          <w:sz w:val="26"/>
+          <w:szCs w:val="26"/>
+          <w:highlight w:val="white"/>
+          <w:rtl w:val="0"/>
+        </w:rPr>
+        <w:t xml:space="preserve">Use sudo incase permission denied error message is showing</w:t>
+      </w:r>
+      <w:r>
+        <w:rPr>
+          <w:sz w:val="26"/>
+          <w:szCs w:val="26"/>
+          <w:shd w:fill="d0e0e3" w:val="clear"/>
+          <w:rtl w:val="0"/>
+        </w:rPr>
+        <w:t xml:space="preserve">.</w:t>
+      </w:r>
+    </w:p>
+    <w:p>
+      <w:pPr>
         <w:rPr>
           <w:sz w:val="24"/>
           <w:szCs w:val="24"/>
@@ -1317,12 +1371,12 @@
           <wp:inline distB="114300" distT="114300" distL="114300" distR="114300">
             <wp:extent cx="5943600" cy="4102100"/>
             <wp:effectExtent b="0" l="0" r="0" t="0"/>
-            <wp:docPr id="10" name="image12.jpg"/>
+            <wp:docPr id="10" name="image9.jpg"/>
             <a:graphic>
               <a:graphicData uri="http://schemas.openxmlformats.org/drawingml/2006/picture">
                 <pic:pic>
                   <pic:nvPicPr>
-                    <pic:cNvPr id="0" name="image12.jpg"/>
+                    <pic:cNvPr id="0" name="image9.jpg"/>
                     <pic:cNvPicPr preferRelativeResize="0"/>
                   </pic:nvPicPr>
                   <pic:blipFill>
@@ -1619,12 +1673,12 @@
           <wp:inline distB="114300" distT="114300" distL="114300" distR="114300">
             <wp:extent cx="5943600" cy="2527300"/>
             <wp:effectExtent b="0" l="0" r="0" t="0"/>
-            <wp:docPr id="9" name="image8.jpg"/>
+            <wp:docPr id="9" name="image5.jpg"/>
             <a:graphic>
               <a:graphicData uri="http://schemas.openxmlformats.org/drawingml/2006/picture">
                 <pic:pic>
                   <pic:nvPicPr>
-                    <pic:cNvPr id="0" name="image8.jpg"/>
+                    <pic:cNvPr id="0" name="image5.jpg"/>
                     <pic:cNvPicPr preferRelativeResize="0"/>
                   </pic:nvPicPr>
                   <pic:blipFill>
@@ -1702,12 +1756,12 @@
           <wp:inline distB="114300" distT="114300" distL="114300" distR="114300">
             <wp:extent cx="5943600" cy="5575300"/>
             <wp:effectExtent b="0" l="0" r="0" t="0"/>
-            <wp:docPr id="1" name="image11.png"/>
+            <wp:docPr id="1" name="image12.png"/>
             <a:graphic>
               <a:graphicData uri="http://schemas.openxmlformats.org/drawingml/2006/picture">
                 <pic:pic>
                   <pic:nvPicPr>
-                    <pic:cNvPr id="0" name="image11.png"/>
+                    <pic:cNvPr id="0" name="image12.png"/>
                     <pic:cNvPicPr preferRelativeResize="0"/>
                   </pic:nvPicPr>
                   <pic:blipFill>
@@ -1930,7 +1984,7 @@
           <w:szCs w:val="24"/>
           <w:rtl w:val="0"/>
         </w:rPr>
-        <w:t xml:space="preserve">Go to the root of tcp_server folder  and open terminal</w:t>
+        <w:t xml:space="preserve">Go to the root of video_transcoding_tool  and open terminal</w:t>
       </w:r>
     </w:p>
     <w:p>
@@ -2064,7 +2118,7 @@
           <w:szCs w:val="24"/>
           <w:rtl w:val="0"/>
         </w:rPr>
-        <w:t xml:space="preserve">Go to the root of tcp_server folder  and open terminal</w:t>
+        <w:t xml:space="preserve">Go to the root of Video_Transcoding _Tool folder  and open terminal(Right click &gt;&gt;select Open in intermediate terminal</w:t>
       </w:r>
     </w:p>
     <w:p>
@@ -2157,12 +2211,12 @@
           <wp:inline distB="114300" distT="114300" distL="114300" distR="114300">
             <wp:extent cx="5943600" cy="3886200"/>
             <wp:effectExtent b="0" l="0" r="0" t="0"/>
-            <wp:docPr id="7" name="image5.jpg"/>
+            <wp:docPr id="7" name="image6.jpg"/>
             <a:graphic>
               <a:graphicData uri="http://schemas.openxmlformats.org/drawingml/2006/picture">
                 <pic:pic>
                   <pic:nvPicPr>
-                    <pic:cNvPr id="0" name="image5.jpg"/>
+                    <pic:cNvPr id="0" name="image6.jpg"/>
                     <pic:cNvPicPr preferRelativeResize="0"/>
                   </pic:nvPicPr>
                   <pic:blipFill>
@@ -2488,6 +2542,53 @@
       </w:pPr>
       <w:r>
         <w:rPr>
+          <w:rtl w:val="0"/>
+        </w:rPr>
+      </w:r>
+    </w:p>
+    <w:p>
+      <w:pPr>
+        <w:rPr>
+          <w:color w:val="202124"/>
+          <w:sz w:val="24"/>
+          <w:szCs w:val="24"/>
+          <w:highlight w:val="white"/>
+        </w:rPr>
+      </w:pPr>
+      <w:r>
+        <w:rPr>
+          <w:b w:val="1"/>
+          <w:color w:val="202124"/>
+          <w:sz w:val="24"/>
+          <w:szCs w:val="24"/>
+          <w:highlight w:val="white"/>
+          <w:rtl w:val="0"/>
+        </w:rPr>
+        <w:t xml:space="preserve">Note:</w:t>
+      </w:r>
+      <w:r>
+        <w:rPr>
+          <w:color w:val="202124"/>
+          <w:sz w:val="24"/>
+          <w:szCs w:val="24"/>
+          <w:highlight w:val="white"/>
+          <w:rtl w:val="0"/>
+        </w:rPr>
+        <w:t xml:space="preserve">IPFS cle needed to be installed.</w:t>
+      </w:r>
+    </w:p>
+    <w:p>
+      <w:pPr>
+        <w:rPr>
+          <w:b w:val="1"/>
+          <w:color w:val="202124"/>
+          <w:sz w:val="24"/>
+          <w:szCs w:val="24"/>
+          <w:highlight w:val="white"/>
+        </w:rPr>
+      </w:pPr>
+      <w:r>
+        <w:rPr>
           <w:b w:val="1"/>
           <w:color w:val="202124"/>
           <w:sz w:val="24"/>
@@ -2509,12 +2610,12 @@
           <wp:inline distB="114300" distT="114300" distL="114300" distR="114300">
             <wp:extent cx="4729163" cy="4789793"/>
             <wp:effectExtent b="0" l="0" r="0" t="0"/>
-            <wp:docPr id="8" name="image9.jpg"/>
+            <wp:docPr id="8" name="image7.jpg"/>
             <a:graphic>
               <a:graphicData uri="http://schemas.openxmlformats.org/drawingml/2006/picture">
                 <pic:pic>
                   <pic:nvPicPr>
-                    <pic:cNvPr id="0" name="image9.jpg"/>
+                    <pic:cNvPr id="0" name="image7.jpg"/>
                     <pic:cNvPicPr preferRelativeResize="0"/>
                   </pic:nvPicPr>
                   <pic:blipFill>
@@ -2670,7 +2771,7 @@
           <w:shd w:fill="c9daf8" w:val="clear"/>
           <w:rtl w:val="0"/>
         </w:rPr>
-        <w:t xml:space="preserve">Ipfs add ./tcp_server -w</w:t>
+        <w:t xml:space="preserve">Ipfs add ./tcp_server.tar  -w</w:t>
       </w:r>
     </w:p>
     <w:p>
@@ -2775,12 +2876,12 @@
           <wp:inline distB="114300" distT="114300" distL="114300" distR="114300">
             <wp:extent cx="5943600" cy="482600"/>
             <wp:effectExtent b="0" l="0" r="0" t="0"/>
-            <wp:docPr id="4" name="image2.jpg"/>
+            <wp:docPr id="4" name="image4.jpg"/>
             <a:graphic>
               <a:graphicData uri="http://schemas.openxmlformats.org/drawingml/2006/picture">
                 <pic:pic>
                   <pic:nvPicPr>
-                    <pic:cNvPr id="0" name="image2.jpg"/>
+                    <pic:cNvPr id="0" name="image4.jpg"/>
                     <pic:cNvPicPr preferRelativeResize="0"/>
                   </pic:nvPicPr>
                   <pic:blipFill>
@@ -2960,7 +3061,7 @@
           <w:shd w:fill="c9daf8" w:val="clear"/>
           <w:rtl w:val="0"/>
         </w:rPr>
-        <w:t xml:space="preserve">Ipfs add ./transcoding_tool -w</w:t>
+        <w:t xml:space="preserve">Ipfs add ./transcoding_tool .tar -w</w:t>
       </w:r>
     </w:p>
     <w:p>
@@ -3039,12 +3140,12 @@
           <wp:inline distB="114300" distT="114300" distL="114300" distR="114300">
             <wp:extent cx="5943600" cy="482600"/>
             <wp:effectExtent b="0" l="0" r="0" t="0"/>
-            <wp:docPr id="6" name="image3.jpg"/>
+            <wp:docPr id="6" name="image2.jpg"/>
             <a:graphic>
               <a:graphicData uri="http://schemas.openxmlformats.org/drawingml/2006/picture">
                 <pic:pic>
                   <pic:nvPicPr>
-                    <pic:cNvPr id="0" name="image3.jpg"/>
+                    <pic:cNvPr id="0" name="image2.jpg"/>
                     <pic:cNvPicPr preferRelativeResize="0"/>
                   </pic:nvPicPr>
                   <pic:blipFill>

</xml_diff>